<commit_message>
Them muc luc tu dong vao bao cao full
</commit_message>
<xml_diff>
--- a/baocao/BaoCao_TatCa.docx
+++ b/baocao/BaoCao_TatCa.docx
@@ -162,6 +162,39 @@
           <w:szCs w:val="26"/>
         </w:rPr>
         <w:t>Hà Nội, 2026</w:t>
+      </w:r>
+    </w:p>
+    <w:p>
+      <w:pPr>
+        <w:jc w:val="center"/>
+      </w:pPr>
+      <w:r>
+        <w:rPr>
+          <w:b/>
+        </w:rPr>
+        <w:t>MỤC LỤC</w:t>
+      </w:r>
+    </w:p>
+    <w:p>
+      <w:r>
+        <w:fldChar w:fldCharType="begin"/>
+      </w:r>
+      <w:r>
+        <w:instrText xml:space="preserve">TOC \o "1-3" \h \z \u</w:instrText>
+      </w:r>
+      <w:r>
+        <w:fldChar w:fldCharType="separate"/>
+      </w:r>
+      <w:r>
+        <w:t>Mở file bằng Word và chọn Update Field để hiện mục lục.</w:t>
+      </w:r>
+      <w:r>
+        <w:fldChar w:fldCharType="end"/>
+      </w:r>
+    </w:p>
+    <w:p>
+      <w:r>
+        <w:br w:type="page"/>
       </w:r>
     </w:p>
     <w:p>

</xml_diff>